<commit_message>
BlueGuard SOC: Final AI Integration
</commit_message>
<xml_diff>
--- a/DocumentationUpdated.docx
+++ b/DocumentationUpdated.docx
@@ -8713,8 +8713,6 @@
           <w:sz w:val="28"/>
         </w:rPr>
       </w:pPr>
-      <w:bookmarkStart w:id="0" w:name="_GoBack"/>
-      <w:bookmarkEnd w:id="0"/>
     </w:p>
     <w:p>
       <w:pPr>
@@ -9381,12 +9379,441 @@
     <w:p>
       <w:pPr>
         <w:spacing w:line="360" w:lineRule="auto"/>
-        <w:jc w:val="both"/>
-        <w:rPr>
-          <w:rFonts w:ascii="Times New Roman" w:hAnsi="Times New Roman"/>
-          <w:sz w:val="24"/>
-        </w:rPr>
-      </w:pPr>
+        <w:ind w:left="720"/>
+        <w:jc w:val="both"/>
+        <w:rPr>
+          <w:rFonts w:ascii="Times New Roman" w:hAnsi="Times New Roman"/>
+          <w:sz w:val="24"/>
+        </w:rPr>
+      </w:pPr>
+    </w:p>
+    <w:p>
+      <w:pPr>
+        <w:spacing w:line="360" w:lineRule="auto"/>
+        <w:ind w:left="720"/>
+        <w:jc w:val="both"/>
+        <w:rPr>
+          <w:rFonts w:ascii="Times New Roman Bold" w:hAnsi="Times New Roman Bold"/>
+          <w:b/>
+          <w:sz w:val="28"/>
+        </w:rPr>
+      </w:pPr>
+      <w:r>
+        <w:rPr>
+          <w:rFonts w:ascii="Times New Roman Bold" w:hAnsi="Times New Roman Bold"/>
+          <w:b/>
+          <w:sz w:val="28"/>
+        </w:rPr>
+        <w:lastRenderedPageBreak/>
+        <w:t>4.2.5 Security Reports</w:t>
+      </w:r>
+    </w:p>
+    <w:p>
+      <w:pPr>
+        <w:spacing w:line="360" w:lineRule="auto"/>
+        <w:ind w:left="720"/>
+        <w:jc w:val="both"/>
+        <w:rPr>
+          <w:rFonts w:ascii="Times New Roman Bold" w:hAnsi="Times New Roman Bold"/>
+          <w:b/>
+          <w:sz w:val="28"/>
+        </w:rPr>
+      </w:pPr>
+      <w:r>
+        <w:rPr>
+          <w:rFonts w:ascii="Times New Roman Bold" w:hAnsi="Times New Roman Bold"/>
+          <w:b/>
+          <w:sz w:val="28"/>
+        </w:rPr>
+        <w:drawing>
+          <wp:inline distT="0" distB="0" distL="0" distR="0" wp14:anchorId="7F44DE06" wp14:editId="6A5DC552">
+            <wp:extent cx="5214796" cy="2730525"/>
+            <wp:effectExtent l="0" t="0" r="5080" b="0"/>
+            <wp:docPr id="9" name="Picture 9"/>
+            <wp:cNvGraphicFramePr>
+              <a:graphicFrameLocks xmlns:a="http://schemas.openxmlformats.org/drawingml/2006/main" noChangeAspect="1"/>
+            </wp:cNvGraphicFramePr>
+            <a:graphic xmlns:a="http://schemas.openxmlformats.org/drawingml/2006/main">
+              <a:graphicData uri="http://schemas.openxmlformats.org/drawingml/2006/picture">
+                <pic:pic xmlns:pic="http://schemas.openxmlformats.org/drawingml/2006/picture">
+                  <pic:nvPicPr>
+                    <pic:cNvPr id="1" name=""/>
+                    <pic:cNvPicPr/>
+                  </pic:nvPicPr>
+                  <pic:blipFill>
+                    <a:blip r:embed="rId20"/>
+                    <a:stretch>
+                      <a:fillRect/>
+                    </a:stretch>
+                  </pic:blipFill>
+                  <pic:spPr>
+                    <a:xfrm>
+                      <a:off x="0" y="0"/>
+                      <a:ext cx="5233204" cy="2740163"/>
+                    </a:xfrm>
+                    <a:prstGeom prst="rect">
+                      <a:avLst/>
+                    </a:prstGeom>
+                  </pic:spPr>
+                </pic:pic>
+              </a:graphicData>
+            </a:graphic>
+          </wp:inline>
+        </w:drawing>
+      </w:r>
+    </w:p>
+    <w:p>
+      <w:pPr>
+        <w:spacing w:line="360" w:lineRule="auto"/>
+        <w:ind w:left="720"/>
+        <w:jc w:val="both"/>
+        <w:rPr>
+          <w:rFonts w:ascii="Times New Roman Bold" w:hAnsi="Times New Roman Bold"/>
+          <w:b/>
+          <w:sz w:val="28"/>
+        </w:rPr>
+      </w:pPr>
+      <w:r>
+        <w:rPr>
+          <w:rFonts w:ascii="Times New Roman Bold" w:hAnsi="Times New Roman Bold"/>
+          <w:b/>
+          <w:sz w:val="28"/>
+        </w:rPr>
+        <w:drawing>
+          <wp:inline distT="0" distB="0" distL="0" distR="0" wp14:anchorId="3B0EB83A" wp14:editId="01FC7882">
+            <wp:extent cx="5260063" cy="1584201"/>
+            <wp:effectExtent l="0" t="0" r="0" b="0"/>
+            <wp:docPr id="10" name="Picture 10"/>
+            <wp:cNvGraphicFramePr>
+              <a:graphicFrameLocks xmlns:a="http://schemas.openxmlformats.org/drawingml/2006/main" noChangeAspect="1"/>
+            </wp:cNvGraphicFramePr>
+            <a:graphic xmlns:a="http://schemas.openxmlformats.org/drawingml/2006/main">
+              <a:graphicData uri="http://schemas.openxmlformats.org/drawingml/2006/picture">
+                <pic:pic xmlns:pic="http://schemas.openxmlformats.org/drawingml/2006/picture">
+                  <pic:nvPicPr>
+                    <pic:cNvPr id="1" name=""/>
+                    <pic:cNvPicPr/>
+                  </pic:nvPicPr>
+                  <pic:blipFill>
+                    <a:blip r:embed="rId21"/>
+                    <a:stretch>
+                      <a:fillRect/>
+                    </a:stretch>
+                  </pic:blipFill>
+                  <pic:spPr>
+                    <a:xfrm>
+                      <a:off x="0" y="0"/>
+                      <a:ext cx="5273462" cy="1588236"/>
+                    </a:xfrm>
+                    <a:prstGeom prst="rect">
+                      <a:avLst/>
+                    </a:prstGeom>
+                  </pic:spPr>
+                </pic:pic>
+              </a:graphicData>
+            </a:graphic>
+          </wp:inline>
+        </w:drawing>
+      </w:r>
+    </w:p>
+    <w:p>
+      <w:pPr>
+        <w:ind w:left="720"/>
+        <w:jc w:val="both"/>
+        <w:rPr>
+          <w:rFonts w:ascii="Times New Roman" w:hAnsi="Times New Roman"/>
+          <w:sz w:val="24"/>
+        </w:rPr>
+      </w:pPr>
+      <w:r>
+        <w:rPr>
+          <w:rFonts w:ascii="Times New Roman" w:hAnsi="Times New Roman"/>
+          <w:sz w:val="24"/>
+        </w:rPr>
+        <w:t>Functional Description: Demonstrates automated auditing capabilities by converting complex security logs into high-level intelligence reports. Essential for regulatory compliance and cross-departmental threat sharing.</w:t>
+      </w:r>
+    </w:p>
+    <w:p>
+      <w:pPr>
+        <w:ind w:left="720"/>
+        <w:jc w:val="both"/>
+        <w:rPr>
+          <w:rFonts w:ascii="Times New Roman" w:hAnsi="Times New Roman"/>
+          <w:sz w:val="24"/>
+        </w:rPr>
+      </w:pPr>
+    </w:p>
+    <w:p>
+      <w:pPr>
+        <w:ind w:left="720"/>
+        <w:jc w:val="both"/>
+        <w:rPr>
+          <w:rFonts w:ascii="Times New Roman" w:hAnsi="Times New Roman"/>
+          <w:sz w:val="24"/>
+        </w:rPr>
+      </w:pPr>
+    </w:p>
+    <w:p>
+      <w:pPr>
+        <w:ind w:left="720"/>
+        <w:jc w:val="both"/>
+        <w:rPr>
+          <w:rFonts w:ascii="Times New Roman" w:hAnsi="Times New Roman"/>
+          <w:sz w:val="24"/>
+        </w:rPr>
+      </w:pPr>
+    </w:p>
+    <w:p>
+      <w:pPr>
+        <w:ind w:left="720"/>
+        <w:jc w:val="both"/>
+        <w:rPr>
+          <w:rFonts w:ascii="Times New Roman" w:hAnsi="Times New Roman"/>
+          <w:sz w:val="24"/>
+        </w:rPr>
+      </w:pPr>
+    </w:p>
+    <w:p>
+      <w:pPr>
+        <w:ind w:left="720"/>
+        <w:jc w:val="both"/>
+        <w:rPr>
+          <w:rFonts w:ascii="Times New Roman" w:hAnsi="Times New Roman"/>
+          <w:sz w:val="24"/>
+        </w:rPr>
+      </w:pPr>
+    </w:p>
+    <w:p>
+      <w:pPr>
+        <w:ind w:left="720"/>
+        <w:jc w:val="both"/>
+        <w:rPr>
+          <w:rFonts w:ascii="Times New Roman" w:hAnsi="Times New Roman"/>
+          <w:sz w:val="24"/>
+        </w:rPr>
+      </w:pPr>
+    </w:p>
+    <w:p>
+      <w:pPr>
+        <w:ind w:left="720"/>
+        <w:jc w:val="both"/>
+        <w:rPr>
+          <w:rFonts w:ascii="Times New Roman" w:hAnsi="Times New Roman"/>
+          <w:sz w:val="24"/>
+        </w:rPr>
+      </w:pPr>
+    </w:p>
+    <w:p>
+      <w:pPr>
+        <w:ind w:left="720"/>
+        <w:jc w:val="both"/>
+        <w:rPr>
+          <w:rFonts w:ascii="Times New Roman" w:hAnsi="Times New Roman"/>
+          <w:sz w:val="24"/>
+        </w:rPr>
+      </w:pPr>
+    </w:p>
+    <w:p>
+      <w:pPr>
+        <w:spacing w:line="360" w:lineRule="auto"/>
+        <w:ind w:left="720"/>
+        <w:jc w:val="both"/>
+        <w:rPr>
+          <w:rFonts w:ascii="Times New Roman Bold" w:hAnsi="Times New Roman Bold"/>
+          <w:b/>
+          <w:sz w:val="28"/>
+        </w:rPr>
+      </w:pPr>
+      <w:r>
+        <w:rPr>
+          <w:rFonts w:ascii="Times New Roman Bold" w:hAnsi="Times New Roman Bold"/>
+          <w:b/>
+          <w:sz w:val="28"/>
+        </w:rPr>
+        <w:lastRenderedPageBreak/>
+        <w:t>4.2.5 Security Reports</w:t>
+      </w:r>
+    </w:p>
+    <w:p>
+      <w:pPr>
+        <w:spacing w:line="360" w:lineRule="auto"/>
+        <w:ind w:left="720"/>
+        <w:jc w:val="both"/>
+        <w:rPr>
+          <w:rFonts w:ascii="Times New Roman Bold" w:hAnsi="Times New Roman Bold"/>
+          <w:b/>
+          <w:sz w:val="28"/>
+        </w:rPr>
+      </w:pPr>
+      <w:r>
+        <w:rPr>
+          <w:rFonts w:ascii="Times New Roman Bold" w:hAnsi="Times New Roman Bold"/>
+          <w:b/>
+          <w:sz w:val="28"/>
+        </w:rPr>
+        <w:drawing>
+          <wp:inline distT="0" distB="0" distL="0" distR="0" wp14:anchorId="12C724F3" wp14:editId="2A39B1DE">
+            <wp:extent cx="5404919" cy="2003169"/>
+            <wp:effectExtent l="0" t="0" r="5715" b="0"/>
+            <wp:docPr id="11" name="Picture 11"/>
+            <wp:cNvGraphicFramePr>
+              <a:graphicFrameLocks xmlns:a="http://schemas.openxmlformats.org/drawingml/2006/main" noChangeAspect="1"/>
+            </wp:cNvGraphicFramePr>
+            <a:graphic xmlns:a="http://schemas.openxmlformats.org/drawingml/2006/main">
+              <a:graphicData uri="http://schemas.openxmlformats.org/drawingml/2006/picture">
+                <pic:pic xmlns:pic="http://schemas.openxmlformats.org/drawingml/2006/picture">
+                  <pic:nvPicPr>
+                    <pic:cNvPr id="1" name=""/>
+                    <pic:cNvPicPr/>
+                  </pic:nvPicPr>
+                  <pic:blipFill>
+                    <a:blip r:embed="rId22"/>
+                    <a:stretch>
+                      <a:fillRect/>
+                    </a:stretch>
+                  </pic:blipFill>
+                  <pic:spPr>
+                    <a:xfrm>
+                      <a:off x="0" y="0"/>
+                      <a:ext cx="5419400" cy="2008536"/>
+                    </a:xfrm>
+                    <a:prstGeom prst="rect">
+                      <a:avLst/>
+                    </a:prstGeom>
+                  </pic:spPr>
+                </pic:pic>
+              </a:graphicData>
+            </a:graphic>
+          </wp:inline>
+        </w:drawing>
+      </w:r>
+    </w:p>
+    <w:p>
+      <w:pPr>
+        <w:spacing w:line="360" w:lineRule="auto"/>
+        <w:ind w:left="720"/>
+        <w:jc w:val="both"/>
+        <w:rPr>
+          <w:rFonts w:ascii="Times New Roman" w:hAnsi="Times New Roman"/>
+          <w:sz w:val="24"/>
+          <w:szCs w:val="24"/>
+        </w:rPr>
+      </w:pPr>
+      <w:r>
+        <w:rPr>
+          <w:rFonts w:ascii="Times New Roman" w:hAnsi="Times New Roman"/>
+          <w:sz w:val="24"/>
+          <w:szCs w:val="24"/>
+        </w:rPr>
+        <w:t>This screen demonstrates the infrastructure health monitoring and real-time asset discovery capabilities of BlueGuard. The system automatically identifies active endpoints from the live alert stream, eliminating the need for manual registration. By aggregating threat data, it calculates a dynamic Risk-Based Health Score (0-100%) for each asset using severity weights. This provides the SOC analyst with a centralized, real-time posture assessment of every machine in the network, allowing them to prioritize remediation based on asset criticality.</w:t>
+      </w:r>
+    </w:p>
+    <w:p>
+      <w:pPr>
+        <w:spacing w:line="360" w:lineRule="auto"/>
+        <w:jc w:val="both"/>
+        <w:rPr>
+          <w:rFonts w:ascii="Times New Roman" w:hAnsi="Times New Roman"/>
+          <w:sz w:val="24"/>
+        </w:rPr>
+      </w:pPr>
+    </w:p>
+    <w:p>
+      <w:pPr>
+        <w:spacing w:line="360" w:lineRule="auto"/>
+        <w:ind w:left="720"/>
+        <w:jc w:val="both"/>
+        <w:rPr>
+          <w:rFonts w:ascii="Times New Roman" w:hAnsi="Times New Roman"/>
+          <w:sz w:val="24"/>
+        </w:rPr>
+      </w:pPr>
+    </w:p>
+    <w:p>
+      <w:pPr>
+        <w:spacing w:line="360" w:lineRule="auto"/>
+        <w:ind w:left="720"/>
+        <w:jc w:val="both"/>
+        <w:rPr>
+          <w:rFonts w:ascii="Times New Roman" w:hAnsi="Times New Roman"/>
+          <w:sz w:val="24"/>
+        </w:rPr>
+      </w:pPr>
+    </w:p>
+    <w:p>
+      <w:pPr>
+        <w:spacing w:line="360" w:lineRule="auto"/>
+        <w:ind w:left="720"/>
+        <w:jc w:val="both"/>
+        <w:rPr>
+          <w:rFonts w:ascii="Times New Roman" w:hAnsi="Times New Roman"/>
+          <w:sz w:val="24"/>
+        </w:rPr>
+      </w:pPr>
+    </w:p>
+    <w:p>
+      <w:pPr>
+        <w:spacing w:line="360" w:lineRule="auto"/>
+        <w:ind w:left="720"/>
+        <w:jc w:val="both"/>
+        <w:rPr>
+          <w:rFonts w:ascii="Times New Roman" w:hAnsi="Times New Roman"/>
+          <w:sz w:val="24"/>
+        </w:rPr>
+      </w:pPr>
+    </w:p>
+    <w:p>
+      <w:pPr>
+        <w:spacing w:line="360" w:lineRule="auto"/>
+        <w:ind w:left="720"/>
+        <w:jc w:val="both"/>
+        <w:rPr>
+          <w:rFonts w:ascii="Times New Roman" w:hAnsi="Times New Roman"/>
+          <w:sz w:val="24"/>
+        </w:rPr>
+      </w:pPr>
+    </w:p>
+    <w:p>
+      <w:pPr>
+        <w:spacing w:line="360" w:lineRule="auto"/>
+        <w:jc w:val="both"/>
+        <w:rPr>
+          <w:rFonts w:ascii="Times New Roman" w:hAnsi="Times New Roman"/>
+          <w:sz w:val="24"/>
+        </w:rPr>
+      </w:pPr>
+    </w:p>
+    <w:p>
+      <w:pPr>
+        <w:spacing w:line="360" w:lineRule="auto"/>
+        <w:jc w:val="both"/>
+        <w:rPr>
+          <w:rFonts w:ascii="Times New Roman" w:hAnsi="Times New Roman"/>
+          <w:sz w:val="24"/>
+        </w:rPr>
+      </w:pPr>
+    </w:p>
+    <w:p>
+      <w:pPr>
+        <w:spacing w:line="360" w:lineRule="auto"/>
+        <w:jc w:val="both"/>
+        <w:rPr>
+          <w:rFonts w:ascii="Times New Roman" w:hAnsi="Times New Roman"/>
+          <w:sz w:val="24"/>
+        </w:rPr>
+      </w:pPr>
+    </w:p>
+    <w:p>
+      <w:pPr>
+        <w:spacing w:line="360" w:lineRule="auto"/>
+        <w:jc w:val="both"/>
+        <w:rPr>
+          <w:rFonts w:ascii="Times New Roman" w:hAnsi="Times New Roman"/>
+          <w:sz w:val="24"/>
+        </w:rPr>
+      </w:pPr>
+      <w:bookmarkStart w:id="0" w:name="_GoBack"/>
+      <w:bookmarkEnd w:id="0"/>
     </w:p>
     <w:p>
       <w:pPr>
@@ -23609,7 +24036,7 @@
                     <pic:cNvPicPr/>
                   </pic:nvPicPr>
                   <pic:blipFill>
-                    <a:blip r:embed="rId20" cstate="print">
+                    <a:blip r:embed="rId23" cstate="print">
                       <a:extLst>
                         <a:ext uri="{28A0092B-C50C-407E-A947-70E740481C1C}">
                           <a14:useLocalDpi xmlns:a14="http://schemas.microsoft.com/office/drawing/2010/main" val="0"/>
@@ -23726,7 +24153,7 @@
                     <pic:cNvPicPr/>
                   </pic:nvPicPr>
                   <pic:blipFill>
-                    <a:blip r:embed="rId21" cstate="print">
+                    <a:blip r:embed="rId24" cstate="print">
                       <a:extLst>
                         <a:ext uri="{28A0092B-C50C-407E-A947-70E740481C1C}">
                           <a14:useLocalDpi xmlns:a14="http://schemas.microsoft.com/office/drawing/2010/main" val="0"/>
@@ -25173,7 +25600,7 @@
         </w:rPr>
         <w:t xml:space="preserve">Flask Web Development Documentation: </w:t>
       </w:r>
-      <w:hyperlink r:id="rId22" w:history="1">
+      <w:hyperlink r:id="rId25" w:history="1">
         <w:r>
           <w:rPr>
             <w:rStyle w:val="Hyperlink"/>
@@ -25204,7 +25631,7 @@
         </w:rPr>
         <w:t xml:space="preserve">Tailwind CSS Framework Documentation: </w:t>
       </w:r>
-      <w:hyperlink r:id="rId23" w:history="1">
+      <w:hyperlink r:id="rId26" w:history="1">
         <w:r>
           <w:rPr>
             <w:rStyle w:val="Hyperlink"/>
@@ -25235,7 +25662,7 @@
         </w:rPr>
         <w:t xml:space="preserve">MongoDB &amp; PyMongo Official Documentation: </w:t>
       </w:r>
-      <w:hyperlink r:id="rId24" w:history="1">
+      <w:hyperlink r:id="rId27" w:history="1">
         <w:r>
           <w:rPr>
             <w:rStyle w:val="Hyperlink"/>
@@ -25266,7 +25693,7 @@
         </w:rPr>
         <w:t xml:space="preserve">Wazuh SIEM Rules &amp; Webhook Integration: </w:t>
       </w:r>
-      <w:hyperlink r:id="rId25" w:history="1">
+      <w:hyperlink r:id="rId28" w:history="1">
         <w:r>
           <w:rPr>
             <w:rStyle w:val="Hyperlink"/>
@@ -25297,7 +25724,7 @@
         </w:rPr>
         <w:t xml:space="preserve">MITRE ATT&amp;CK Framework Reference: </w:t>
       </w:r>
-      <w:hyperlink r:id="rId26" w:history="1">
+      <w:hyperlink r:id="rId29" w:history="1">
         <w:r>
           <w:rPr>
             <w:rStyle w:val="Hyperlink"/>
@@ -25328,7 +25755,7 @@
         </w:rPr>
         <w:t xml:space="preserve">Python requests Library for API Management: </w:t>
       </w:r>
-      <w:hyperlink r:id="rId27" w:history="1">
+      <w:hyperlink r:id="rId30" w:history="1">
         <w:r>
           <w:rPr>
             <w:rStyle w:val="Hyperlink"/>
@@ -25359,7 +25786,7 @@
         </w:rPr>
         <w:t xml:space="preserve">"Understanding Alert Fatigue in SOCs" (Cybersecurity Context): </w:t>
       </w:r>
-      <w:hyperlink r:id="rId28" w:history="1">
+      <w:hyperlink r:id="rId31" w:history="1">
         <w:r>
           <w:rPr>
             <w:rStyle w:val="Hyperlink"/>
@@ -25382,7 +25809,7 @@
       </w:pPr>
     </w:p>
     <w:sectPr>
-      <w:footerReference w:type="default" r:id="rId29"/>
+      <w:footerReference w:type="default" r:id="rId32"/>
       <w:pgSz w:w="12240" w:h="15840"/>
       <w:pgMar w:top="1440" w:right="1440" w:bottom="1440" w:left="1440" w:header="720" w:footer="720" w:gutter="0"/>
       <w:pgBorders w:offsetFrom="page">
@@ -25433,7 +25860,6 @@
         <w:docPartUnique/>
       </w:docPartObj>
     </w:sdtPr>
-    <w:sdtEndPr/>
     <w:sdtContent>
       <w:p>
         <w:pPr>
@@ -30403,7 +30829,7 @@
   <w:style w:type="paragraph" w:default="1" w:styleId="Normal">
     <w:name w:val="Normal"/>
     <w:qFormat/>
-    <w:rsid w:val="00713EF2"/>
+    <w:rsid w:val="00382402"/>
   </w:style>
   <w:style w:type="character" w:default="1" w:styleId="DefaultParagraphFont">
     <w:name w:val="Default Paragraph Font"/>

</xml_diff>